<commit_message>
rererr - Commented GitLatch Commit @ 2024-7-2-11-23-33-684
</commit_message>
<xml_diff>
--- a/Ewc123122333www.docx
+++ b/Ewc123122333www.docx
@@ -59,23 +59,27 @@
         </w:rPr>
         <w:t xml:space="preserve"> </w:t>
       </w:r>
-      <w:proofErr w:type="spellStart"/>
       <w:r>
         <w:rPr>
           <w:lang w:val="en-IN"/>
         </w:rPr>
         <w:t>tesing</w:t>
       </w:r>
-      <w:proofErr w:type="spellEnd"/>
       <w:r>
         <w:rPr>
           <w:lang w:val="en-IN"/>
         </w:rPr>
         <w:t xml:space="preserve"> fine</w:t>
       </w:r>
+      <w:r>
+        <w:rPr>
+          <w:lang w:val="en-IN"/>
+        </w:rPr>
+        <w:t>22</w:t>
+      </w:r>
     </w:p>
     <w:sectPr>
-      <w:pgSz w:w="12240" w:h="15840"/>
+      <w:pgSz w:w="12240" w:h="15840" w:orient="portrait"/>
       <w:pgMar w:top="1440" w:right="1440" w:bottom="1440" w:left="1440" w:header="720" w:footer="720" w:gutter="0"/>
       <w:cols w:space="720"/>
       <w:docGrid w:linePitch="360"/>
@@ -139,7 +143,7 @@
   <w:docDefaults>
     <w:rPrDefault>
       <w:rPr>
-        <w:rFonts w:asciiTheme="minorHAnsi" w:eastAsiaTheme="minorHAnsi" w:hAnsiTheme="minorHAnsi" w:cstheme="minorBidi"/>
+        <w:rFonts w:asciiTheme="minorHAnsi" w:hAnsiTheme="minorHAnsi" w:eastAsiaTheme="minorHAnsi" w:cstheme="minorBidi"/>
         <w:kern w:val="2"/>
         <w:sz w:val="22"/>
         <w:szCs w:val="22"/>
@@ -156,14 +160,14 @@
   <w:latentStyles w:defLockedState="0" w:defUIPriority="99" w:defSemiHidden="0" w:defUnhideWhenUsed="0" w:defQFormat="0" w:count="376">
     <w:lsdException w:name="Normal" w:uiPriority="0" w:qFormat="1"/>
     <w:lsdException w:name="heading 1" w:uiPriority="9" w:qFormat="1"/>
-    <w:lsdException w:name="heading 2" w:semiHidden="1" w:uiPriority="9" w:unhideWhenUsed="1" w:qFormat="1"/>
-    <w:lsdException w:name="heading 3" w:semiHidden="1" w:uiPriority="9" w:unhideWhenUsed="1" w:qFormat="1"/>
-    <w:lsdException w:name="heading 4" w:semiHidden="1" w:uiPriority="9" w:unhideWhenUsed="1" w:qFormat="1"/>
-    <w:lsdException w:name="heading 5" w:semiHidden="1" w:uiPriority="9" w:unhideWhenUsed="1" w:qFormat="1"/>
-    <w:lsdException w:name="heading 6" w:semiHidden="1" w:uiPriority="9" w:unhideWhenUsed="1" w:qFormat="1"/>
-    <w:lsdException w:name="heading 7" w:semiHidden="1" w:uiPriority="9" w:unhideWhenUsed="1" w:qFormat="1"/>
-    <w:lsdException w:name="heading 8" w:semiHidden="1" w:uiPriority="9" w:unhideWhenUsed="1" w:qFormat="1"/>
-    <w:lsdException w:name="heading 9" w:semiHidden="1" w:uiPriority="9" w:unhideWhenUsed="1" w:qFormat="1"/>
+    <w:lsdException w:name="heading 2" w:uiPriority="9" w:semiHidden="1" w:unhideWhenUsed="1" w:qFormat="1"/>
+    <w:lsdException w:name="heading 3" w:uiPriority="9" w:semiHidden="1" w:unhideWhenUsed="1" w:qFormat="1"/>
+    <w:lsdException w:name="heading 4" w:uiPriority="9" w:semiHidden="1" w:unhideWhenUsed="1" w:qFormat="1"/>
+    <w:lsdException w:name="heading 5" w:uiPriority="9" w:semiHidden="1" w:unhideWhenUsed="1" w:qFormat="1"/>
+    <w:lsdException w:name="heading 6" w:uiPriority="9" w:semiHidden="1" w:unhideWhenUsed="1" w:qFormat="1"/>
+    <w:lsdException w:name="heading 7" w:uiPriority="9" w:semiHidden="1" w:unhideWhenUsed="1" w:qFormat="1"/>
+    <w:lsdException w:name="heading 8" w:uiPriority="9" w:semiHidden="1" w:unhideWhenUsed="1" w:qFormat="1"/>
+    <w:lsdException w:name="heading 9" w:uiPriority="9" w:semiHidden="1" w:unhideWhenUsed="1" w:qFormat="1"/>
     <w:lsdException w:name="index 1" w:semiHidden="1" w:unhideWhenUsed="1"/>
     <w:lsdException w:name="index 2" w:semiHidden="1" w:unhideWhenUsed="1"/>
     <w:lsdException w:name="index 3" w:semiHidden="1" w:unhideWhenUsed="1"/>
@@ -173,22 +177,22 @@
     <w:lsdException w:name="index 7" w:semiHidden="1" w:unhideWhenUsed="1"/>
     <w:lsdException w:name="index 8" w:semiHidden="1" w:unhideWhenUsed="1"/>
     <w:lsdException w:name="index 9" w:semiHidden="1" w:unhideWhenUsed="1"/>
-    <w:lsdException w:name="toc 1" w:semiHidden="1" w:uiPriority="39" w:unhideWhenUsed="1"/>
-    <w:lsdException w:name="toc 2" w:semiHidden="1" w:uiPriority="39" w:unhideWhenUsed="1"/>
-    <w:lsdException w:name="toc 3" w:semiHidden="1" w:uiPriority="39" w:unhideWhenUsed="1"/>
-    <w:lsdException w:name="toc 4" w:semiHidden="1" w:uiPriority="39" w:unhideWhenUsed="1"/>
-    <w:lsdException w:name="toc 5" w:semiHidden="1" w:uiPriority="39" w:unhideWhenUsed="1"/>
-    <w:lsdException w:name="toc 6" w:semiHidden="1" w:uiPriority="39" w:unhideWhenUsed="1"/>
-    <w:lsdException w:name="toc 7" w:semiHidden="1" w:uiPriority="39" w:unhideWhenUsed="1"/>
-    <w:lsdException w:name="toc 8" w:semiHidden="1" w:uiPriority="39" w:unhideWhenUsed="1"/>
-    <w:lsdException w:name="toc 9" w:semiHidden="1" w:uiPriority="39" w:unhideWhenUsed="1"/>
+    <w:lsdException w:name="toc 1" w:uiPriority="39" w:semiHidden="1" w:unhideWhenUsed="1"/>
+    <w:lsdException w:name="toc 2" w:uiPriority="39" w:semiHidden="1" w:unhideWhenUsed="1"/>
+    <w:lsdException w:name="toc 3" w:uiPriority="39" w:semiHidden="1" w:unhideWhenUsed="1"/>
+    <w:lsdException w:name="toc 4" w:uiPriority="39" w:semiHidden="1" w:unhideWhenUsed="1"/>
+    <w:lsdException w:name="toc 5" w:uiPriority="39" w:semiHidden="1" w:unhideWhenUsed="1"/>
+    <w:lsdException w:name="toc 6" w:uiPriority="39" w:semiHidden="1" w:unhideWhenUsed="1"/>
+    <w:lsdException w:name="toc 7" w:uiPriority="39" w:semiHidden="1" w:unhideWhenUsed="1"/>
+    <w:lsdException w:name="toc 8" w:uiPriority="39" w:semiHidden="1" w:unhideWhenUsed="1"/>
+    <w:lsdException w:name="toc 9" w:uiPriority="39" w:semiHidden="1" w:unhideWhenUsed="1"/>
     <w:lsdException w:name="Normal Indent" w:semiHidden="1" w:unhideWhenUsed="1"/>
     <w:lsdException w:name="footnote text" w:semiHidden="1" w:unhideWhenUsed="1"/>
     <w:lsdException w:name="annotation text" w:semiHidden="1" w:unhideWhenUsed="1"/>
     <w:lsdException w:name="header" w:semiHidden="1" w:unhideWhenUsed="1"/>
     <w:lsdException w:name="footer" w:semiHidden="1" w:unhideWhenUsed="1"/>
     <w:lsdException w:name="index heading" w:semiHidden="1" w:unhideWhenUsed="1"/>
-    <w:lsdException w:name="caption" w:semiHidden="1" w:uiPriority="35" w:unhideWhenUsed="1" w:qFormat="1"/>
+    <w:lsdException w:name="caption" w:uiPriority="35" w:semiHidden="1" w:unhideWhenUsed="1" w:qFormat="1"/>
     <w:lsdException w:name="table of figures" w:semiHidden="1" w:unhideWhenUsed="1"/>
     <w:lsdException w:name="envelope address" w:semiHidden="1" w:unhideWhenUsed="1"/>
     <w:lsdException w:name="envelope return" w:semiHidden="1" w:unhideWhenUsed="1"/>
@@ -219,7 +223,7 @@
     <w:lsdException w:name="Title" w:uiPriority="10" w:qFormat="1"/>
     <w:lsdException w:name="Closing" w:semiHidden="1" w:unhideWhenUsed="1"/>
     <w:lsdException w:name="Signature" w:semiHidden="1" w:unhideWhenUsed="1"/>
-    <w:lsdException w:name="Default Paragraph Font" w:semiHidden="1" w:uiPriority="1" w:unhideWhenUsed="1"/>
+    <w:lsdException w:name="Default Paragraph Font" w:uiPriority="1" w:semiHidden="1" w:unhideWhenUsed="1"/>
     <w:lsdException w:name="Body Text" w:semiHidden="1" w:unhideWhenUsed="1"/>
     <w:lsdException w:name="Body Text Indent" w:semiHidden="1" w:unhideWhenUsed="1"/>
     <w:lsdException w:name="List Continue" w:semiHidden="1" w:unhideWhenUsed="1"/>
@@ -419,8 +423,8 @@
     <w:lsdException w:name="Subtle Reference" w:uiPriority="31" w:qFormat="1"/>
     <w:lsdException w:name="Intense Reference" w:uiPriority="32" w:qFormat="1"/>
     <w:lsdException w:name="Book Title" w:uiPriority="33" w:qFormat="1"/>
-    <w:lsdException w:name="Bibliography" w:semiHidden="1" w:uiPriority="37" w:unhideWhenUsed="1"/>
-    <w:lsdException w:name="TOC Heading" w:semiHidden="1" w:uiPriority="39" w:unhideWhenUsed="1" w:qFormat="1"/>
+    <w:lsdException w:name="Bibliography" w:uiPriority="37" w:semiHidden="1" w:unhideWhenUsed="1"/>
+    <w:lsdException w:name="TOC Heading" w:uiPriority="39" w:semiHidden="1" w:unhideWhenUsed="1" w:qFormat="1"/>
     <w:lsdException w:name="Plain Table 1" w:uiPriority="41"/>
     <w:lsdException w:name="Plain Table 2" w:uiPriority="42"/>
     <w:lsdException w:name="Plain Table 3" w:uiPriority="43"/>
@@ -531,7 +535,7 @@
     <w:lsdException w:name="Unresolved Mention" w:semiHidden="1" w:unhideWhenUsed="1"/>
     <w:lsdException w:name="Smart Link" w:semiHidden="1" w:unhideWhenUsed="1"/>
   </w:latentStyles>
-  <w:style w:type="paragraph" w:default="1" w:styleId="Normal">
+  <w:style w:type="paragraph" w:styleId="Normal" w:default="1">
     <w:name w:val="Normal"/>
     <w:qFormat/>
     <w:rsid w:val="005D0846"/>
@@ -554,7 +558,7 @@
       <w:outlineLvl w:val="0"/>
     </w:pPr>
     <w:rPr>
-      <w:rFonts w:asciiTheme="majorHAnsi" w:eastAsiaTheme="majorEastAsia" w:hAnsiTheme="majorHAnsi" w:cstheme="majorBidi"/>
+      <w:rFonts w:asciiTheme="majorHAnsi" w:hAnsiTheme="majorHAnsi" w:eastAsiaTheme="majorEastAsia" w:cstheme="majorBidi"/>
       <w:color w:val="0F4761" w:themeColor="accent1" w:themeShade="BF"/>
       <w:sz w:val="40"/>
       <w:szCs w:val="40"/>
@@ -577,7 +581,7 @@
       <w:outlineLvl w:val="1"/>
     </w:pPr>
     <w:rPr>
-      <w:rFonts w:asciiTheme="majorHAnsi" w:eastAsiaTheme="majorEastAsia" w:hAnsiTheme="majorHAnsi" w:cstheme="majorBidi"/>
+      <w:rFonts w:asciiTheme="majorHAnsi" w:hAnsiTheme="majorHAnsi" w:eastAsiaTheme="majorEastAsia" w:cstheme="majorBidi"/>
       <w:color w:val="0F4761" w:themeColor="accent1" w:themeShade="BF"/>
       <w:sz w:val="32"/>
       <w:szCs w:val="32"/>
@@ -738,13 +742,13 @@
       <w:color w:val="272727" w:themeColor="text1" w:themeTint="D8"/>
     </w:rPr>
   </w:style>
-  <w:style w:type="character" w:default="1" w:styleId="DefaultParagraphFont">
+  <w:style w:type="character" w:styleId="DefaultParagraphFont" w:default="1">
     <w:name w:val="Default Paragraph Font"/>
     <w:uiPriority w:val="1"/>
     <w:semiHidden/>
     <w:unhideWhenUsed/>
   </w:style>
-  <w:style w:type="table" w:default="1" w:styleId="TableNormal">
+  <w:style w:type="table" w:styleId="TableNormal" w:default="1">
     <w:name w:val="Normal Table"/>
     <w:uiPriority w:val="99"/>
     <w:semiHidden/>
@@ -759,26 +763,26 @@
       </w:tblCellMar>
     </w:tblPr>
   </w:style>
-  <w:style w:type="numbering" w:default="1" w:styleId="NoList">
+  <w:style w:type="numbering" w:styleId="NoList" w:default="1">
     <w:name w:val="No List"/>
     <w:uiPriority w:val="99"/>
     <w:semiHidden/>
     <w:unhideWhenUsed/>
   </w:style>
-  <w:style w:type="character" w:customStyle="1" w:styleId="Heading1Char">
+  <w:style w:type="character" w:styleId="Heading1Char" w:customStyle="1">
     <w:name w:val="Heading 1 Char"/>
     <w:basedOn w:val="DefaultParagraphFont"/>
     <w:link w:val="Heading1"/>
     <w:uiPriority w:val="9"/>
     <w:rsid w:val="00BA4DD2"/>
     <w:rPr>
-      <w:rFonts w:asciiTheme="majorHAnsi" w:eastAsiaTheme="majorEastAsia" w:hAnsiTheme="majorHAnsi" w:cstheme="majorBidi"/>
+      <w:rFonts w:asciiTheme="majorHAnsi" w:hAnsiTheme="majorHAnsi" w:eastAsiaTheme="majorEastAsia" w:cstheme="majorBidi"/>
       <w:color w:val="0F4761" w:themeColor="accent1" w:themeShade="BF"/>
       <w:sz w:val="40"/>
       <w:szCs w:val="40"/>
     </w:rPr>
   </w:style>
-  <w:style w:type="character" w:customStyle="1" w:styleId="Heading2Char">
+  <w:style w:type="character" w:styleId="Heading2Char" w:customStyle="1">
     <w:name w:val="Heading 2 Char"/>
     <w:basedOn w:val="DefaultParagraphFont"/>
     <w:link w:val="Heading2"/>
@@ -786,13 +790,13 @@
     <w:semiHidden/>
     <w:rsid w:val="00BA4DD2"/>
     <w:rPr>
-      <w:rFonts w:asciiTheme="majorHAnsi" w:eastAsiaTheme="majorEastAsia" w:hAnsiTheme="majorHAnsi" w:cstheme="majorBidi"/>
+      <w:rFonts w:asciiTheme="majorHAnsi" w:hAnsiTheme="majorHAnsi" w:eastAsiaTheme="majorEastAsia" w:cstheme="majorBidi"/>
       <w:color w:val="0F4761" w:themeColor="accent1" w:themeShade="BF"/>
       <w:sz w:val="32"/>
       <w:szCs w:val="32"/>
     </w:rPr>
   </w:style>
-  <w:style w:type="character" w:customStyle="1" w:styleId="Heading3Char">
+  <w:style w:type="character" w:styleId="Heading3Char" w:customStyle="1">
     <w:name w:val="Heading 3 Char"/>
     <w:basedOn w:val="DefaultParagraphFont"/>
     <w:link w:val="Heading3"/>
@@ -806,7 +810,7 @@
       <w:szCs w:val="28"/>
     </w:rPr>
   </w:style>
-  <w:style w:type="character" w:customStyle="1" w:styleId="Heading4Char">
+  <w:style w:type="character" w:styleId="Heading4Char" w:customStyle="1">
     <w:name w:val="Heading 4 Char"/>
     <w:basedOn w:val="DefaultParagraphFont"/>
     <w:link w:val="Heading4"/>
@@ -820,7 +824,7 @@
       <w:color w:val="0F4761" w:themeColor="accent1" w:themeShade="BF"/>
     </w:rPr>
   </w:style>
-  <w:style w:type="character" w:customStyle="1" w:styleId="Heading5Char">
+  <w:style w:type="character" w:styleId="Heading5Char" w:customStyle="1">
     <w:name w:val="Heading 5 Char"/>
     <w:basedOn w:val="DefaultParagraphFont"/>
     <w:link w:val="Heading5"/>
@@ -832,7 +836,7 @@
       <w:color w:val="0F4761" w:themeColor="accent1" w:themeShade="BF"/>
     </w:rPr>
   </w:style>
-  <w:style w:type="character" w:customStyle="1" w:styleId="Heading6Char">
+  <w:style w:type="character" w:styleId="Heading6Char" w:customStyle="1">
     <w:name w:val="Heading 6 Char"/>
     <w:basedOn w:val="DefaultParagraphFont"/>
     <w:link w:val="Heading6"/>
@@ -846,7 +850,7 @@
       <w:color w:val="595959" w:themeColor="text1" w:themeTint="A6"/>
     </w:rPr>
   </w:style>
-  <w:style w:type="character" w:customStyle="1" w:styleId="Heading7Char">
+  <w:style w:type="character" w:styleId="Heading7Char" w:customStyle="1">
     <w:name w:val="Heading 7 Char"/>
     <w:basedOn w:val="DefaultParagraphFont"/>
     <w:link w:val="Heading7"/>
@@ -858,7 +862,7 @@
       <w:color w:val="595959" w:themeColor="text1" w:themeTint="A6"/>
     </w:rPr>
   </w:style>
-  <w:style w:type="character" w:customStyle="1" w:styleId="Heading8Char">
+  <w:style w:type="character" w:styleId="Heading8Char" w:customStyle="1">
     <w:name w:val="Heading 8 Char"/>
     <w:basedOn w:val="DefaultParagraphFont"/>
     <w:link w:val="Heading8"/>
@@ -872,7 +876,7 @@
       <w:color w:val="272727" w:themeColor="text1" w:themeTint="D8"/>
     </w:rPr>
   </w:style>
-  <w:style w:type="character" w:customStyle="1" w:styleId="Heading9Char">
+  <w:style w:type="character" w:styleId="Heading9Char" w:customStyle="1">
     <w:name w:val="Heading 9 Char"/>
     <w:basedOn w:val="DefaultParagraphFont"/>
     <w:link w:val="Heading9"/>
@@ -897,21 +901,21 @@
       <w:contextualSpacing/>
     </w:pPr>
     <w:rPr>
-      <w:rFonts w:asciiTheme="majorHAnsi" w:eastAsiaTheme="majorEastAsia" w:hAnsiTheme="majorHAnsi" w:cstheme="majorBidi"/>
+      <w:rFonts w:asciiTheme="majorHAnsi" w:hAnsiTheme="majorHAnsi" w:eastAsiaTheme="majorEastAsia" w:cstheme="majorBidi"/>
       <w:spacing w:val="-10"/>
       <w:kern w:val="28"/>
       <w:sz w:val="56"/>
       <w:szCs w:val="56"/>
     </w:rPr>
   </w:style>
-  <w:style w:type="character" w:customStyle="1" w:styleId="TitleChar">
+  <w:style w:type="character" w:styleId="TitleChar" w:customStyle="1">
     <w:name w:val="Title Char"/>
     <w:basedOn w:val="DefaultParagraphFont"/>
     <w:link w:val="Title"/>
     <w:uiPriority w:val="10"/>
     <w:rsid w:val="00BA4DD2"/>
     <w:rPr>
-      <w:rFonts w:asciiTheme="majorHAnsi" w:eastAsiaTheme="majorEastAsia" w:hAnsiTheme="majorHAnsi" w:cstheme="majorBidi"/>
+      <w:rFonts w:asciiTheme="majorHAnsi" w:hAnsiTheme="majorHAnsi" w:eastAsiaTheme="majorEastAsia" w:cstheme="majorBidi"/>
       <w:spacing w:val="-10"/>
       <w:kern w:val="28"/>
       <w:sz w:val="56"/>
@@ -939,7 +943,7 @@
       <w:szCs w:val="28"/>
     </w:rPr>
   </w:style>
-  <w:style w:type="character" w:customStyle="1" w:styleId="SubtitleChar">
+  <w:style w:type="character" w:styleId="SubtitleChar" w:customStyle="1">
     <w:name w:val="Subtitle Char"/>
     <w:basedOn w:val="DefaultParagraphFont"/>
     <w:link w:val="Subtitle"/>
@@ -971,7 +975,7 @@
       <w:color w:val="404040" w:themeColor="text1" w:themeTint="BF"/>
     </w:rPr>
   </w:style>
-  <w:style w:type="character" w:customStyle="1" w:styleId="QuoteChar">
+  <w:style w:type="character" w:styleId="QuoteChar" w:customStyle="1">
     <w:name w:val="Quote Char"/>
     <w:basedOn w:val="DefaultParagraphFont"/>
     <w:link w:val="Quote"/>
@@ -1016,8 +1020,8 @@
     <w:rsid w:val="00BA4DD2"/>
     <w:pPr>
       <w:pBdr>
-        <w:top w:val="single" w:sz="4" w:space="10" w:color="0F4761" w:themeColor="accent1" w:themeShade="BF"/>
-        <w:bottom w:val="single" w:sz="4" w:space="10" w:color="0F4761" w:themeColor="accent1" w:themeShade="BF"/>
+        <w:top w:val="single" w:color="0F4761" w:themeColor="accent1" w:themeShade="BF" w:sz="4" w:space="10"/>
+        <w:bottom w:val="single" w:color="0F4761" w:themeColor="accent1" w:themeShade="BF" w:sz="4" w:space="10"/>
       </w:pBdr>
       <w:spacing w:before="360" w:after="360"/>
       <w:ind w:left="864" w:right="864"/>
@@ -1029,7 +1033,7 @@
       <w:color w:val="0F4761" w:themeColor="accent1" w:themeShade="BF"/>
     </w:rPr>
   </w:style>
-  <w:style w:type="character" w:customStyle="1" w:styleId="IntenseQuoteChar">
+  <w:style w:type="character" w:styleId="IntenseQuoteChar" w:customStyle="1">
     <w:name w:val="Intense Quote Char"/>
     <w:basedOn w:val="DefaultParagraphFont"/>
     <w:link w:val="IntenseQuote"/>
@@ -1070,7 +1074,7 @@
       <w:spacing w:after="0" w:line="240" w:lineRule="auto"/>
     </w:pPr>
   </w:style>
-  <w:style w:type="character" w:customStyle="1" w:styleId="HeaderChar">
+  <w:style w:type="character" w:styleId="HeaderChar" w:customStyle="1">
     <w:name w:val="Header Char"/>
     <w:basedOn w:val="DefaultParagraphFont"/>
     <w:link w:val="Header"/>
@@ -1092,7 +1096,7 @@
       <w:spacing w:after="0" w:line="240" w:lineRule="auto"/>
     </w:pPr>
   </w:style>
-  <w:style w:type="character" w:customStyle="1" w:styleId="FooterChar">
+  <w:style w:type="character" w:styleId="FooterChar" w:customStyle="1">
     <w:name w:val="Footer Char"/>
     <w:basedOn w:val="DefaultParagraphFont"/>
     <w:link w:val="Footer"/>
@@ -1402,6 +1406,17 @@
   <wetp:taskpane dockstate="right" visibility="0" width="525" row="0">
     <wetp:webextensionref xmlns:r="http://schemas.openxmlformats.org/officeDocument/2006/relationships" r:id="rId1"/>
   </wetp:taskpane>
+  <wetp:taskpane dockstate="right" visibility="0" width="350" row="1">
+    <wetp:webextensionref xmlns:r="http://schemas.openxmlformats.org/officeDocument/2006/relationships" r:id="Rbef63f0e4da24ec8"/>
+  </wetp:taskpane>
+</wetp:taskpanes>
+</file>
+
+<file path=word/webextensions/taskpanes253.xml><?xml version="1.0" encoding="utf-8"?>
+<wetp:taskpanes xmlns:wetp="http://schemas.microsoft.com/office/webextensions/taskpanes/2010/11">
+  <wetp:taskpane dockstate="right" visibility="1" width="350" row="4">
+    <wetp:webextensionref xmlns:r="http://schemas.openxmlformats.org/officeDocument/2006/relationships" r:id="rel253"/>
+  </wetp:taskpane>
 </wetp:taskpanes>
 </file>
 
@@ -1415,4 +1430,28 @@
   <we:bindings/>
   <we:snapshot xmlns:r="http://schemas.openxmlformats.org/officeDocument/2006/relationships"/>
 </we:webextension>
+</file>
+
+<file path=word/webextensions/webextension253.xml><?xml version="1.0" encoding="utf-8"?>
+<we:webextension xmlns:we="http://schemas.microsoft.com/office/webextensions/webextension/2010/11" id="0115cf6a-3048-47ca-abd1-7248654a3b50">
+  <we:reference id="0115cf6a-3048-47ca-abd1-7248654a3b50" version="1.0.0.0" store="developer" storeType="uploadfiledevcatalog"/>
+  <we:alternateReferences/>
+  <we:properties>
+    <we:property name="Office.AutoShowTaskpaneWithDocument" value="true"/>
+  </we:properties>
+  <we:bindings/>
+  <we:snapshot xmlns:r="http://schemas.openxmlformats.org/officeDocument/2006/relationships"/>
+</we:webextension>
+</file>
+
+<file path=word/webextensions/webextension3.xml><?xml version="1.0" encoding="utf-8"?>
+<we:webextension xmlns:we="http://schemas.microsoft.com/office/webextensions/webextension/2010/11" id="c1fec54c-20b8-45cc-87f9-af6454e97f92">
+  <we:reference id="0115cf6a-3048-47ca-abd1-7248654a3b50" version="1.0.0.5" store="developer" storeType="uploadfiledevcatalog"/>
+  <we:alternateReferences/>
+  <we:properties>
+    <we:property name="Office.AutoShowTaskpaneWithDocument" value="true"/>
+  </we:properties>
+  <we:bindings/>
+  <we:snapshot xmlns:r="http://schemas.openxmlformats.org/officeDocument/2006/relationships"/>
+</we:webextension>
 </file>
</xml_diff>

<commit_message>
rererfddf - Commented GitLatch Commit @ 2024-7-2-11-31-2-934
</commit_message>
<xml_diff>
--- a/Ewc123122333www.docx
+++ b/Ewc123122333www.docx
@@ -59,12 +59,14 @@
         </w:rPr>
         <w:t xml:space="preserve"> </w:t>
       </w:r>
+      <w:proofErr w:type="spellStart"/>
       <w:r>
         <w:rPr>
           <w:lang w:val="en-IN"/>
         </w:rPr>
         <w:t>tesing</w:t>
       </w:r>
+      <w:proofErr w:type="spellEnd"/>
       <w:r>
         <w:rPr>
           <w:lang w:val="en-IN"/>
@@ -79,7 +81,7 @@
       </w:r>
     </w:p>
     <w:sectPr>
-      <w:pgSz w:w="12240" w:h="15840" w:orient="portrait"/>
+      <w:pgSz w:w="12240" w:h="15840"/>
       <w:pgMar w:top="1440" w:right="1440" w:bottom="1440" w:left="1440" w:header="720" w:footer="720" w:gutter="0"/>
       <w:cols w:space="720"/>
       <w:docGrid w:linePitch="360"/>
@@ -143,7 +145,7 @@
   <w:docDefaults>
     <w:rPrDefault>
       <w:rPr>
-        <w:rFonts w:asciiTheme="minorHAnsi" w:hAnsiTheme="minorHAnsi" w:eastAsiaTheme="minorHAnsi" w:cstheme="minorBidi"/>
+        <w:rFonts w:asciiTheme="minorHAnsi" w:eastAsiaTheme="minorHAnsi" w:hAnsiTheme="minorHAnsi" w:cstheme="minorBidi"/>
         <w:kern w:val="2"/>
         <w:sz w:val="22"/>
         <w:szCs w:val="22"/>
@@ -160,14 +162,14 @@
   <w:latentStyles w:defLockedState="0" w:defUIPriority="99" w:defSemiHidden="0" w:defUnhideWhenUsed="0" w:defQFormat="0" w:count="376">
     <w:lsdException w:name="Normal" w:uiPriority="0" w:qFormat="1"/>
     <w:lsdException w:name="heading 1" w:uiPriority="9" w:qFormat="1"/>
-    <w:lsdException w:name="heading 2" w:uiPriority="9" w:semiHidden="1" w:unhideWhenUsed="1" w:qFormat="1"/>
-    <w:lsdException w:name="heading 3" w:uiPriority="9" w:semiHidden="1" w:unhideWhenUsed="1" w:qFormat="1"/>
-    <w:lsdException w:name="heading 4" w:uiPriority="9" w:semiHidden="1" w:unhideWhenUsed="1" w:qFormat="1"/>
-    <w:lsdException w:name="heading 5" w:uiPriority="9" w:semiHidden="1" w:unhideWhenUsed="1" w:qFormat="1"/>
-    <w:lsdException w:name="heading 6" w:uiPriority="9" w:semiHidden="1" w:unhideWhenUsed="1" w:qFormat="1"/>
-    <w:lsdException w:name="heading 7" w:uiPriority="9" w:semiHidden="1" w:unhideWhenUsed="1" w:qFormat="1"/>
-    <w:lsdException w:name="heading 8" w:uiPriority="9" w:semiHidden="1" w:unhideWhenUsed="1" w:qFormat="1"/>
-    <w:lsdException w:name="heading 9" w:uiPriority="9" w:semiHidden="1" w:unhideWhenUsed="1" w:qFormat="1"/>
+    <w:lsdException w:name="heading 2" w:semiHidden="1" w:uiPriority="9" w:unhideWhenUsed="1" w:qFormat="1"/>
+    <w:lsdException w:name="heading 3" w:semiHidden="1" w:uiPriority="9" w:unhideWhenUsed="1" w:qFormat="1"/>
+    <w:lsdException w:name="heading 4" w:semiHidden="1" w:uiPriority="9" w:unhideWhenUsed="1" w:qFormat="1"/>
+    <w:lsdException w:name="heading 5" w:semiHidden="1" w:uiPriority="9" w:unhideWhenUsed="1" w:qFormat="1"/>
+    <w:lsdException w:name="heading 6" w:semiHidden="1" w:uiPriority="9" w:unhideWhenUsed="1" w:qFormat="1"/>
+    <w:lsdException w:name="heading 7" w:semiHidden="1" w:uiPriority="9" w:unhideWhenUsed="1" w:qFormat="1"/>
+    <w:lsdException w:name="heading 8" w:semiHidden="1" w:uiPriority="9" w:unhideWhenUsed="1" w:qFormat="1"/>
+    <w:lsdException w:name="heading 9" w:semiHidden="1" w:uiPriority="9" w:unhideWhenUsed="1" w:qFormat="1"/>
     <w:lsdException w:name="index 1" w:semiHidden="1" w:unhideWhenUsed="1"/>
     <w:lsdException w:name="index 2" w:semiHidden="1" w:unhideWhenUsed="1"/>
     <w:lsdException w:name="index 3" w:semiHidden="1" w:unhideWhenUsed="1"/>
@@ -177,22 +179,22 @@
     <w:lsdException w:name="index 7" w:semiHidden="1" w:unhideWhenUsed="1"/>
     <w:lsdException w:name="index 8" w:semiHidden="1" w:unhideWhenUsed="1"/>
     <w:lsdException w:name="index 9" w:semiHidden="1" w:unhideWhenUsed="1"/>
-    <w:lsdException w:name="toc 1" w:uiPriority="39" w:semiHidden="1" w:unhideWhenUsed="1"/>
-    <w:lsdException w:name="toc 2" w:uiPriority="39" w:semiHidden="1" w:unhideWhenUsed="1"/>
-    <w:lsdException w:name="toc 3" w:uiPriority="39" w:semiHidden="1" w:unhideWhenUsed="1"/>
-    <w:lsdException w:name="toc 4" w:uiPriority="39" w:semiHidden="1" w:unhideWhenUsed="1"/>
-    <w:lsdException w:name="toc 5" w:uiPriority="39" w:semiHidden="1" w:unhideWhenUsed="1"/>
-    <w:lsdException w:name="toc 6" w:uiPriority="39" w:semiHidden="1" w:unhideWhenUsed="1"/>
-    <w:lsdException w:name="toc 7" w:uiPriority="39" w:semiHidden="1" w:unhideWhenUsed="1"/>
-    <w:lsdException w:name="toc 8" w:uiPriority="39" w:semiHidden="1" w:unhideWhenUsed="1"/>
-    <w:lsdException w:name="toc 9" w:uiPriority="39" w:semiHidden="1" w:unhideWhenUsed="1"/>
+    <w:lsdException w:name="toc 1" w:semiHidden="1" w:uiPriority="39" w:unhideWhenUsed="1"/>
+    <w:lsdException w:name="toc 2" w:semiHidden="1" w:uiPriority="39" w:unhideWhenUsed="1"/>
+    <w:lsdException w:name="toc 3" w:semiHidden="1" w:uiPriority="39" w:unhideWhenUsed="1"/>
+    <w:lsdException w:name="toc 4" w:semiHidden="1" w:uiPriority="39" w:unhideWhenUsed="1"/>
+    <w:lsdException w:name="toc 5" w:semiHidden="1" w:uiPriority="39" w:unhideWhenUsed="1"/>
+    <w:lsdException w:name="toc 6" w:semiHidden="1" w:uiPriority="39" w:unhideWhenUsed="1"/>
+    <w:lsdException w:name="toc 7" w:semiHidden="1" w:uiPriority="39" w:unhideWhenUsed="1"/>
+    <w:lsdException w:name="toc 8" w:semiHidden="1" w:uiPriority="39" w:unhideWhenUsed="1"/>
+    <w:lsdException w:name="toc 9" w:semiHidden="1" w:uiPriority="39" w:unhideWhenUsed="1"/>
     <w:lsdException w:name="Normal Indent" w:semiHidden="1" w:unhideWhenUsed="1"/>
     <w:lsdException w:name="footnote text" w:semiHidden="1" w:unhideWhenUsed="1"/>
     <w:lsdException w:name="annotation text" w:semiHidden="1" w:unhideWhenUsed="1"/>
     <w:lsdException w:name="header" w:semiHidden="1" w:unhideWhenUsed="1"/>
     <w:lsdException w:name="footer" w:semiHidden="1" w:unhideWhenUsed="1"/>
     <w:lsdException w:name="index heading" w:semiHidden="1" w:unhideWhenUsed="1"/>
-    <w:lsdException w:name="caption" w:uiPriority="35" w:semiHidden="1" w:unhideWhenUsed="1" w:qFormat="1"/>
+    <w:lsdException w:name="caption" w:semiHidden="1" w:uiPriority="35" w:unhideWhenUsed="1" w:qFormat="1"/>
     <w:lsdException w:name="table of figures" w:semiHidden="1" w:unhideWhenUsed="1"/>
     <w:lsdException w:name="envelope address" w:semiHidden="1" w:unhideWhenUsed="1"/>
     <w:lsdException w:name="envelope return" w:semiHidden="1" w:unhideWhenUsed="1"/>
@@ -223,7 +225,7 @@
     <w:lsdException w:name="Title" w:uiPriority="10" w:qFormat="1"/>
     <w:lsdException w:name="Closing" w:semiHidden="1" w:unhideWhenUsed="1"/>
     <w:lsdException w:name="Signature" w:semiHidden="1" w:unhideWhenUsed="1"/>
-    <w:lsdException w:name="Default Paragraph Font" w:uiPriority="1" w:semiHidden="1" w:unhideWhenUsed="1"/>
+    <w:lsdException w:name="Default Paragraph Font" w:semiHidden="1" w:uiPriority="1" w:unhideWhenUsed="1"/>
     <w:lsdException w:name="Body Text" w:semiHidden="1" w:unhideWhenUsed="1"/>
     <w:lsdException w:name="Body Text Indent" w:semiHidden="1" w:unhideWhenUsed="1"/>
     <w:lsdException w:name="List Continue" w:semiHidden="1" w:unhideWhenUsed="1"/>
@@ -423,8 +425,8 @@
     <w:lsdException w:name="Subtle Reference" w:uiPriority="31" w:qFormat="1"/>
     <w:lsdException w:name="Intense Reference" w:uiPriority="32" w:qFormat="1"/>
     <w:lsdException w:name="Book Title" w:uiPriority="33" w:qFormat="1"/>
-    <w:lsdException w:name="Bibliography" w:uiPriority="37" w:semiHidden="1" w:unhideWhenUsed="1"/>
-    <w:lsdException w:name="TOC Heading" w:uiPriority="39" w:semiHidden="1" w:unhideWhenUsed="1" w:qFormat="1"/>
+    <w:lsdException w:name="Bibliography" w:semiHidden="1" w:uiPriority="37" w:unhideWhenUsed="1"/>
+    <w:lsdException w:name="TOC Heading" w:semiHidden="1" w:uiPriority="39" w:unhideWhenUsed="1" w:qFormat="1"/>
     <w:lsdException w:name="Plain Table 1" w:uiPriority="41"/>
     <w:lsdException w:name="Plain Table 2" w:uiPriority="42"/>
     <w:lsdException w:name="Plain Table 3" w:uiPriority="43"/>
@@ -535,7 +537,7 @@
     <w:lsdException w:name="Unresolved Mention" w:semiHidden="1" w:unhideWhenUsed="1"/>
     <w:lsdException w:name="Smart Link" w:semiHidden="1" w:unhideWhenUsed="1"/>
   </w:latentStyles>
-  <w:style w:type="paragraph" w:styleId="Normal" w:default="1">
+  <w:style w:type="paragraph" w:default="1" w:styleId="Normal">
     <w:name w:val="Normal"/>
     <w:qFormat/>
     <w:rsid w:val="005D0846"/>
@@ -558,7 +560,7 @@
       <w:outlineLvl w:val="0"/>
     </w:pPr>
     <w:rPr>
-      <w:rFonts w:asciiTheme="majorHAnsi" w:hAnsiTheme="majorHAnsi" w:eastAsiaTheme="majorEastAsia" w:cstheme="majorBidi"/>
+      <w:rFonts w:asciiTheme="majorHAnsi" w:eastAsiaTheme="majorEastAsia" w:hAnsiTheme="majorHAnsi" w:cstheme="majorBidi"/>
       <w:color w:val="0F4761" w:themeColor="accent1" w:themeShade="BF"/>
       <w:sz w:val="40"/>
       <w:szCs w:val="40"/>
@@ -581,7 +583,7 @@
       <w:outlineLvl w:val="1"/>
     </w:pPr>
     <w:rPr>
-      <w:rFonts w:asciiTheme="majorHAnsi" w:hAnsiTheme="majorHAnsi" w:eastAsiaTheme="majorEastAsia" w:cstheme="majorBidi"/>
+      <w:rFonts w:asciiTheme="majorHAnsi" w:eastAsiaTheme="majorEastAsia" w:hAnsiTheme="majorHAnsi" w:cstheme="majorBidi"/>
       <w:color w:val="0F4761" w:themeColor="accent1" w:themeShade="BF"/>
       <w:sz w:val="32"/>
       <w:szCs w:val="32"/>
@@ -742,13 +744,13 @@
       <w:color w:val="272727" w:themeColor="text1" w:themeTint="D8"/>
     </w:rPr>
   </w:style>
-  <w:style w:type="character" w:styleId="DefaultParagraphFont" w:default="1">
+  <w:style w:type="character" w:default="1" w:styleId="DefaultParagraphFont">
     <w:name w:val="Default Paragraph Font"/>
     <w:uiPriority w:val="1"/>
     <w:semiHidden/>
     <w:unhideWhenUsed/>
   </w:style>
-  <w:style w:type="table" w:styleId="TableNormal" w:default="1">
+  <w:style w:type="table" w:default="1" w:styleId="TableNormal">
     <w:name w:val="Normal Table"/>
     <w:uiPriority w:val="99"/>
     <w:semiHidden/>
@@ -763,26 +765,26 @@
       </w:tblCellMar>
     </w:tblPr>
   </w:style>
-  <w:style w:type="numbering" w:styleId="NoList" w:default="1">
+  <w:style w:type="numbering" w:default="1" w:styleId="NoList">
     <w:name w:val="No List"/>
     <w:uiPriority w:val="99"/>
     <w:semiHidden/>
     <w:unhideWhenUsed/>
   </w:style>
-  <w:style w:type="character" w:styleId="Heading1Char" w:customStyle="1">
+  <w:style w:type="character" w:customStyle="1" w:styleId="Heading1Char">
     <w:name w:val="Heading 1 Char"/>
     <w:basedOn w:val="DefaultParagraphFont"/>
     <w:link w:val="Heading1"/>
     <w:uiPriority w:val="9"/>
     <w:rsid w:val="00BA4DD2"/>
     <w:rPr>
-      <w:rFonts w:asciiTheme="majorHAnsi" w:hAnsiTheme="majorHAnsi" w:eastAsiaTheme="majorEastAsia" w:cstheme="majorBidi"/>
+      <w:rFonts w:asciiTheme="majorHAnsi" w:eastAsiaTheme="majorEastAsia" w:hAnsiTheme="majorHAnsi" w:cstheme="majorBidi"/>
       <w:color w:val="0F4761" w:themeColor="accent1" w:themeShade="BF"/>
       <w:sz w:val="40"/>
       <w:szCs w:val="40"/>
     </w:rPr>
   </w:style>
-  <w:style w:type="character" w:styleId="Heading2Char" w:customStyle="1">
+  <w:style w:type="character" w:customStyle="1" w:styleId="Heading2Char">
     <w:name w:val="Heading 2 Char"/>
     <w:basedOn w:val="DefaultParagraphFont"/>
     <w:link w:val="Heading2"/>
@@ -790,13 +792,13 @@
     <w:semiHidden/>
     <w:rsid w:val="00BA4DD2"/>
     <w:rPr>
-      <w:rFonts w:asciiTheme="majorHAnsi" w:hAnsiTheme="majorHAnsi" w:eastAsiaTheme="majorEastAsia" w:cstheme="majorBidi"/>
+      <w:rFonts w:asciiTheme="majorHAnsi" w:eastAsiaTheme="majorEastAsia" w:hAnsiTheme="majorHAnsi" w:cstheme="majorBidi"/>
       <w:color w:val="0F4761" w:themeColor="accent1" w:themeShade="BF"/>
       <w:sz w:val="32"/>
       <w:szCs w:val="32"/>
     </w:rPr>
   </w:style>
-  <w:style w:type="character" w:styleId="Heading3Char" w:customStyle="1">
+  <w:style w:type="character" w:customStyle="1" w:styleId="Heading3Char">
     <w:name w:val="Heading 3 Char"/>
     <w:basedOn w:val="DefaultParagraphFont"/>
     <w:link w:val="Heading3"/>
@@ -810,7 +812,7 @@
       <w:szCs w:val="28"/>
     </w:rPr>
   </w:style>
-  <w:style w:type="character" w:styleId="Heading4Char" w:customStyle="1">
+  <w:style w:type="character" w:customStyle="1" w:styleId="Heading4Char">
     <w:name w:val="Heading 4 Char"/>
     <w:basedOn w:val="DefaultParagraphFont"/>
     <w:link w:val="Heading4"/>
@@ -824,7 +826,7 @@
       <w:color w:val="0F4761" w:themeColor="accent1" w:themeShade="BF"/>
     </w:rPr>
   </w:style>
-  <w:style w:type="character" w:styleId="Heading5Char" w:customStyle="1">
+  <w:style w:type="character" w:customStyle="1" w:styleId="Heading5Char">
     <w:name w:val="Heading 5 Char"/>
     <w:basedOn w:val="DefaultParagraphFont"/>
     <w:link w:val="Heading5"/>
@@ -836,7 +838,7 @@
       <w:color w:val="0F4761" w:themeColor="accent1" w:themeShade="BF"/>
     </w:rPr>
   </w:style>
-  <w:style w:type="character" w:styleId="Heading6Char" w:customStyle="1">
+  <w:style w:type="character" w:customStyle="1" w:styleId="Heading6Char">
     <w:name w:val="Heading 6 Char"/>
     <w:basedOn w:val="DefaultParagraphFont"/>
     <w:link w:val="Heading6"/>
@@ -850,7 +852,7 @@
       <w:color w:val="595959" w:themeColor="text1" w:themeTint="A6"/>
     </w:rPr>
   </w:style>
-  <w:style w:type="character" w:styleId="Heading7Char" w:customStyle="1">
+  <w:style w:type="character" w:customStyle="1" w:styleId="Heading7Char">
     <w:name w:val="Heading 7 Char"/>
     <w:basedOn w:val="DefaultParagraphFont"/>
     <w:link w:val="Heading7"/>
@@ -862,7 +864,7 @@
       <w:color w:val="595959" w:themeColor="text1" w:themeTint="A6"/>
     </w:rPr>
   </w:style>
-  <w:style w:type="character" w:styleId="Heading8Char" w:customStyle="1">
+  <w:style w:type="character" w:customStyle="1" w:styleId="Heading8Char">
     <w:name w:val="Heading 8 Char"/>
     <w:basedOn w:val="DefaultParagraphFont"/>
     <w:link w:val="Heading8"/>
@@ -876,7 +878,7 @@
       <w:color w:val="272727" w:themeColor="text1" w:themeTint="D8"/>
     </w:rPr>
   </w:style>
-  <w:style w:type="character" w:styleId="Heading9Char" w:customStyle="1">
+  <w:style w:type="character" w:customStyle="1" w:styleId="Heading9Char">
     <w:name w:val="Heading 9 Char"/>
     <w:basedOn w:val="DefaultParagraphFont"/>
     <w:link w:val="Heading9"/>
@@ -901,21 +903,21 @@
       <w:contextualSpacing/>
     </w:pPr>
     <w:rPr>
-      <w:rFonts w:asciiTheme="majorHAnsi" w:hAnsiTheme="majorHAnsi" w:eastAsiaTheme="majorEastAsia" w:cstheme="majorBidi"/>
+      <w:rFonts w:asciiTheme="majorHAnsi" w:eastAsiaTheme="majorEastAsia" w:hAnsiTheme="majorHAnsi" w:cstheme="majorBidi"/>
       <w:spacing w:val="-10"/>
       <w:kern w:val="28"/>
       <w:sz w:val="56"/>
       <w:szCs w:val="56"/>
     </w:rPr>
   </w:style>
-  <w:style w:type="character" w:styleId="TitleChar" w:customStyle="1">
+  <w:style w:type="character" w:customStyle="1" w:styleId="TitleChar">
     <w:name w:val="Title Char"/>
     <w:basedOn w:val="DefaultParagraphFont"/>
     <w:link w:val="Title"/>
     <w:uiPriority w:val="10"/>
     <w:rsid w:val="00BA4DD2"/>
     <w:rPr>
-      <w:rFonts w:asciiTheme="majorHAnsi" w:hAnsiTheme="majorHAnsi" w:eastAsiaTheme="majorEastAsia" w:cstheme="majorBidi"/>
+      <w:rFonts w:asciiTheme="majorHAnsi" w:eastAsiaTheme="majorEastAsia" w:hAnsiTheme="majorHAnsi" w:cstheme="majorBidi"/>
       <w:spacing w:val="-10"/>
       <w:kern w:val="28"/>
       <w:sz w:val="56"/>
@@ -943,7 +945,7 @@
       <w:szCs w:val="28"/>
     </w:rPr>
   </w:style>
-  <w:style w:type="character" w:styleId="SubtitleChar" w:customStyle="1">
+  <w:style w:type="character" w:customStyle="1" w:styleId="SubtitleChar">
     <w:name w:val="Subtitle Char"/>
     <w:basedOn w:val="DefaultParagraphFont"/>
     <w:link w:val="Subtitle"/>
@@ -975,7 +977,7 @@
       <w:color w:val="404040" w:themeColor="text1" w:themeTint="BF"/>
     </w:rPr>
   </w:style>
-  <w:style w:type="character" w:styleId="QuoteChar" w:customStyle="1">
+  <w:style w:type="character" w:customStyle="1" w:styleId="QuoteChar">
     <w:name w:val="Quote Char"/>
     <w:basedOn w:val="DefaultParagraphFont"/>
     <w:link w:val="Quote"/>
@@ -1020,8 +1022,8 @@
     <w:rsid w:val="00BA4DD2"/>
     <w:pPr>
       <w:pBdr>
-        <w:top w:val="single" w:color="0F4761" w:themeColor="accent1" w:themeShade="BF" w:sz="4" w:space="10"/>
-        <w:bottom w:val="single" w:color="0F4761" w:themeColor="accent1" w:themeShade="BF" w:sz="4" w:space="10"/>
+        <w:top w:val="single" w:sz="4" w:space="10" w:color="0F4761" w:themeColor="accent1" w:themeShade="BF"/>
+        <w:bottom w:val="single" w:sz="4" w:space="10" w:color="0F4761" w:themeColor="accent1" w:themeShade="BF"/>
       </w:pBdr>
       <w:spacing w:before="360" w:after="360"/>
       <w:ind w:left="864" w:right="864"/>
@@ -1033,7 +1035,7 @@
       <w:color w:val="0F4761" w:themeColor="accent1" w:themeShade="BF"/>
     </w:rPr>
   </w:style>
-  <w:style w:type="character" w:styleId="IntenseQuoteChar" w:customStyle="1">
+  <w:style w:type="character" w:customStyle="1" w:styleId="IntenseQuoteChar">
     <w:name w:val="Intense Quote Char"/>
     <w:basedOn w:val="DefaultParagraphFont"/>
     <w:link w:val="IntenseQuote"/>
@@ -1074,7 +1076,7 @@
       <w:spacing w:after="0" w:line="240" w:lineRule="auto"/>
     </w:pPr>
   </w:style>
-  <w:style w:type="character" w:styleId="HeaderChar" w:customStyle="1">
+  <w:style w:type="character" w:customStyle="1" w:styleId="HeaderChar">
     <w:name w:val="Header Char"/>
     <w:basedOn w:val="DefaultParagraphFont"/>
     <w:link w:val="Header"/>
@@ -1096,7 +1098,7 @@
       <w:spacing w:after="0" w:line="240" w:lineRule="auto"/>
     </w:pPr>
   </w:style>
-  <w:style w:type="character" w:styleId="FooterChar" w:customStyle="1">
+  <w:style w:type="character" w:customStyle="1" w:styleId="FooterChar">
     <w:name w:val="Footer Char"/>
     <w:basedOn w:val="DefaultParagraphFont"/>
     <w:link w:val="Footer"/>
@@ -1406,47 +1408,12 @@
   <wetp:taskpane dockstate="right" visibility="0" width="525" row="0">
     <wetp:webextensionref xmlns:r="http://schemas.openxmlformats.org/officeDocument/2006/relationships" r:id="rId1"/>
   </wetp:taskpane>
-  <wetp:taskpane dockstate="right" visibility="0" width="350" row="1">
-    <wetp:webextensionref xmlns:r="http://schemas.openxmlformats.org/officeDocument/2006/relationships" r:id="R8e1b701265274822"/>
-  </wetp:taskpane>
-</wetp:taskpanes>
-</file>
-
-<file path=word/webextensions/taskpanes253.xml><?xml version="1.0" encoding="utf-8"?>
-<wetp:taskpanes xmlns:wetp="http://schemas.microsoft.com/office/webextensions/taskpanes/2010/11">
-  <wetp:taskpane dockstate="right" visibility="1" width="350" row="4">
-    <wetp:webextensionref xmlns:r="http://schemas.openxmlformats.org/officeDocument/2006/relationships" r:id="rel253"/>
-  </wetp:taskpane>
 </wetp:taskpanes>
 </file>
 
 <file path=word/webextensions/webextension1.xml><?xml version="1.0" encoding="utf-8"?>
-<we:webextension xmlns:we="http://schemas.microsoft.com/office/webextensions/webextension/2010/11" id="{875BBCCD-66D0-4A50-A0E6-F6F9634B1415}">
-  <we:reference id="0115cf6a-3048-47ca-abd1-7248654a3b50" version="1.0.0.4" store="developer" storeType="Registry"/>
-  <we:alternateReferences/>
-  <we:properties>
-    <we:property name="Office.AutoShowTaskpaneWithDocument" value="true"/>
-  </we:properties>
-  <we:bindings/>
-  <we:snapshot xmlns:r="http://schemas.openxmlformats.org/officeDocument/2006/relationships"/>
-</we:webextension>
-</file>
-
-<file path=word/webextensions/webextension253.xml><?xml version="1.0" encoding="utf-8"?>
-<we:webextension xmlns:we="http://schemas.microsoft.com/office/webextensions/webextension/2010/11" id="0115cf6a-3048-47ca-abd1-7248654a3b50">
-  <we:reference id="0115cf6a-3048-47ca-abd1-7248654a3b50" version="1.0.0.0" store="developer" storeType="uploadfiledevcatalog"/>
-  <we:alternateReferences/>
-  <we:properties>
-    <we:property name="Office.AutoShowTaskpaneWithDocument" value="true"/>
-  </we:properties>
-  <we:bindings/>
-  <we:snapshot xmlns:r="http://schemas.openxmlformats.org/officeDocument/2006/relationships"/>
-</we:webextension>
-</file>
-
-<file path=word/webextensions/webextension3.xml><?xml version="1.0" encoding="utf-8"?>
-<we:webextension xmlns:we="http://schemas.microsoft.com/office/webextensions/webextension/2010/11" id="c1fec54c-20b8-45cc-87f9-af6454e97f92">
-  <we:reference id="0115cf6a-3048-47ca-abd1-7248654a3b50" version="1.0.0.5" store="developer" storeType="uploadfiledevcatalog"/>
+<we:webextension xmlns:we="http://schemas.microsoft.com/office/webextensions/webextension/2010/11" id="{EAB5F2B1-2A5A-460F-BFC3-4A1A1F48CA5E}">
+  <we:reference id="0115cf6a-3048-47ca-abd1-7248654a3b50" version="1.0.0.5" store="developer" storeType="Registry"/>
   <we:alternateReferences/>
   <we:properties>
     <we:property name="Office.AutoShowTaskpaneWithDocument" value="true"/>

</xml_diff>

<commit_message>
123mac - Commented GitLatch Commit @ 2024-7-2-17-26-49-480
</commit_message>
<xml_diff>
--- a/Ewc123122333www.docx
+++ b/Ewc123122333www.docx
@@ -1,6 +1,6 @@
 
 <file path=word/document.xml><?xml version="1.0" encoding="utf-8"?>
-<w:document xmlns:wpc="http://schemas.microsoft.com/office/word/2010/wordprocessingCanvas" xmlns:cx="http://schemas.microsoft.com/office/drawing/2014/chartex" xmlns:cx1="http://schemas.microsoft.com/office/drawing/2015/9/8/chartex" xmlns:cx2="http://schemas.microsoft.com/office/drawing/2015/10/21/chartex" xmlns:cx3="http://schemas.microsoft.com/office/drawing/2016/5/9/chartex" xmlns:cx4="http://schemas.microsoft.com/office/drawing/2016/5/10/chartex" xmlns:cx5="http://schemas.microsoft.com/office/drawing/2016/5/11/chartex" xmlns:cx6="http://schemas.microsoft.com/office/drawing/2016/5/12/chartex" xmlns:cx7="http://schemas.microsoft.com/office/drawing/2016/5/13/chartex" xmlns:cx8="http://schemas.microsoft.com/office/drawing/2016/5/14/chartex" xmlns:mc="http://schemas.openxmlformats.org/markup-compatibility/2006" xmlns:aink="http://schemas.microsoft.com/office/drawing/2016/ink" xmlns:am3d="http://schemas.microsoft.com/office/drawing/2017/model3d" xmlns:o="urn:schemas-microsoft-com:office:office" xmlns:oel="http://schemas.microsoft.com/office/2019/extlst" xmlns:r="http://schemas.openxmlformats.org/officeDocument/2006/relationships" xmlns:m="http://schemas.openxmlformats.org/officeDocument/2006/math" xmlns:v="urn:schemas-microsoft-com:vml" xmlns:wp14="http://schemas.microsoft.com/office/word/2010/wordprocessingDrawing" xmlns:wp="http://schemas.openxmlformats.org/drawingml/2006/wordprocessingDrawing" xmlns:w10="urn:schemas-microsoft-com:office:word" xmlns:w="http://schemas.openxmlformats.org/wordprocessingml/2006/main" xmlns:w14="http://schemas.microsoft.com/office/word/2010/wordml" xmlns:w15="http://schemas.microsoft.com/office/word/2012/wordml" xmlns:w16cex="http://schemas.microsoft.com/office/word/2018/wordml/cex" xmlns:w16cid="http://schemas.microsoft.com/office/word/2016/wordml/cid" xmlns:w16="http://schemas.microsoft.com/office/word/2018/wordml" xmlns:w16du="http://schemas.microsoft.com/office/word/2023/wordml/word16du" xmlns:w16sdtdh="http://schemas.microsoft.com/office/word/2020/wordml/sdtdatahash" xmlns:w16se="http://schemas.microsoft.com/office/word/2015/wordml/symex" xmlns:wpg="http://schemas.microsoft.com/office/word/2010/wordprocessingGroup" xmlns:wpi="http://schemas.microsoft.com/office/word/2010/wordprocessingInk" xmlns:wne="http://schemas.microsoft.com/office/word/2006/wordml" xmlns:wps="http://schemas.microsoft.com/office/word/2010/wordprocessingShape" mc:Ignorable="w14 w15 w16se w16cid w16 w16cex w16sdtdh w16du wp14">
+<w:document xmlns:wpc="http://schemas.microsoft.com/office/word/2010/wordprocessingCanvas" xmlns:cx="http://schemas.microsoft.com/office/drawing/2014/chartex" xmlns:cx1="http://schemas.microsoft.com/office/drawing/2015/9/8/chartex" xmlns:cx2="http://schemas.microsoft.com/office/drawing/2015/10/21/chartex" xmlns:cx3="http://schemas.microsoft.com/office/drawing/2016/5/9/chartex" xmlns:cx4="http://schemas.microsoft.com/office/drawing/2016/5/10/chartex" xmlns:cx5="http://schemas.microsoft.com/office/drawing/2016/5/11/chartex" xmlns:cx6="http://schemas.microsoft.com/office/drawing/2016/5/12/chartex" xmlns:cx7="http://schemas.microsoft.com/office/drawing/2016/5/13/chartex" xmlns:cx8="http://schemas.microsoft.com/office/drawing/2016/5/14/chartex" xmlns:mc="http://schemas.openxmlformats.org/markup-compatibility/2006" xmlns:aink="http://schemas.microsoft.com/office/drawing/2016/ink" xmlns:am3d="http://schemas.microsoft.com/office/drawing/2017/model3d" xmlns:o="urn:schemas-microsoft-com:office:office" xmlns:oel="http://schemas.microsoft.com/office/2019/extlst" xmlns:r="http://schemas.openxmlformats.org/officeDocument/2006/relationships" xmlns:m="http://schemas.openxmlformats.org/officeDocument/2006/math" xmlns:v="urn:schemas-microsoft-com:vml" xmlns:wp14="http://schemas.microsoft.com/office/word/2010/wordprocessingDrawing" xmlns:wp="http://schemas.openxmlformats.org/drawingml/2006/wordprocessingDrawing" xmlns:w10="urn:schemas-microsoft-com:office:word" xmlns:w="http://schemas.openxmlformats.org/wordprocessingml/2006/main" xmlns:w14="http://schemas.microsoft.com/office/word/2010/wordml" xmlns:w15="http://schemas.microsoft.com/office/word/2012/wordml" xmlns:w16cex="http://schemas.microsoft.com/office/word/2018/wordml/cex" xmlns:w16cid="http://schemas.microsoft.com/office/word/2016/wordml/cid" xmlns:w16="http://schemas.microsoft.com/office/word/2018/wordml" xmlns:w16sdtdh="http://schemas.microsoft.com/office/word/2020/wordml/sdtdatahash" xmlns:w16se="http://schemas.microsoft.com/office/word/2015/wordml/symex" xmlns:wpg="http://schemas.microsoft.com/office/word/2010/wordprocessingGroup" xmlns:wpi="http://schemas.microsoft.com/office/word/2010/wordprocessingInk" xmlns:wne="http://schemas.microsoft.com/office/word/2006/wordml" xmlns:wps="http://schemas.microsoft.com/office/word/2010/wordprocessingShape" mc:Ignorable="w14 w15 w16se w16cid w16 w16cex w16sdtdh wp14">
   <w:body>
     <w:p>
       <w:pPr>
@@ -79,6 +79,12 @@
         </w:rPr>
         <w:t>22</w:t>
       </w:r>
+      <w:r>
+        <w:rPr>
+          <w:lang w:val="en-IN"/>
+        </w:rPr>
+        <w:t>erer22</w:t>
+      </w:r>
     </w:p>
     <w:sectPr>
       <w:pgSz w:w="12240" w:h="15840"/>
@@ -91,7 +97,7 @@
 </file>
 
 <file path=word/endnotes.xml><?xml version="1.0" encoding="utf-8"?>
-<w:endnotes xmlns:wpc="http://schemas.microsoft.com/office/word/2010/wordprocessingCanvas" xmlns:cx="http://schemas.microsoft.com/office/drawing/2014/chartex" xmlns:cx1="http://schemas.microsoft.com/office/drawing/2015/9/8/chartex" xmlns:cx2="http://schemas.microsoft.com/office/drawing/2015/10/21/chartex" xmlns:cx3="http://schemas.microsoft.com/office/drawing/2016/5/9/chartex" xmlns:cx4="http://schemas.microsoft.com/office/drawing/2016/5/10/chartex" xmlns:cx5="http://schemas.microsoft.com/office/drawing/2016/5/11/chartex" xmlns:cx6="http://schemas.microsoft.com/office/drawing/2016/5/12/chartex" xmlns:cx7="http://schemas.microsoft.com/office/drawing/2016/5/13/chartex" xmlns:cx8="http://schemas.microsoft.com/office/drawing/2016/5/14/chartex" xmlns:mc="http://schemas.openxmlformats.org/markup-compatibility/2006" xmlns:aink="http://schemas.microsoft.com/office/drawing/2016/ink" xmlns:am3d="http://schemas.microsoft.com/office/drawing/2017/model3d" xmlns:o="urn:schemas-microsoft-com:office:office" xmlns:oel="http://schemas.microsoft.com/office/2019/extlst" xmlns:r="http://schemas.openxmlformats.org/officeDocument/2006/relationships" xmlns:m="http://schemas.openxmlformats.org/officeDocument/2006/math" xmlns:v="urn:schemas-microsoft-com:vml" xmlns:wp14="http://schemas.microsoft.com/office/word/2010/wordprocessingDrawing" xmlns:wp="http://schemas.openxmlformats.org/drawingml/2006/wordprocessingDrawing" xmlns:w10="urn:schemas-microsoft-com:office:word" xmlns:w="http://schemas.openxmlformats.org/wordprocessingml/2006/main" xmlns:w14="http://schemas.microsoft.com/office/word/2010/wordml" xmlns:w15="http://schemas.microsoft.com/office/word/2012/wordml" xmlns:w16cex="http://schemas.microsoft.com/office/word/2018/wordml/cex" xmlns:w16cid="http://schemas.microsoft.com/office/word/2016/wordml/cid" xmlns:w16="http://schemas.microsoft.com/office/word/2018/wordml" xmlns:w16du="http://schemas.microsoft.com/office/word/2023/wordml/word16du" xmlns:w16sdtdh="http://schemas.microsoft.com/office/word/2020/wordml/sdtdatahash" xmlns:w16se="http://schemas.microsoft.com/office/word/2015/wordml/symex" xmlns:wpg="http://schemas.microsoft.com/office/word/2010/wordprocessingGroup" xmlns:wpi="http://schemas.microsoft.com/office/word/2010/wordprocessingInk" xmlns:wne="http://schemas.microsoft.com/office/word/2006/wordml" xmlns:wps="http://schemas.microsoft.com/office/word/2010/wordprocessingShape" mc:Ignorable="w14 w15 w16se w16cid w16 w16cex w16sdtdh w16du wp14">
+<w:endnotes xmlns:wpc="http://schemas.microsoft.com/office/word/2010/wordprocessingCanvas" xmlns:cx="http://schemas.microsoft.com/office/drawing/2014/chartex" xmlns:cx1="http://schemas.microsoft.com/office/drawing/2015/9/8/chartex" xmlns:cx2="http://schemas.microsoft.com/office/drawing/2015/10/21/chartex" xmlns:cx3="http://schemas.microsoft.com/office/drawing/2016/5/9/chartex" xmlns:cx4="http://schemas.microsoft.com/office/drawing/2016/5/10/chartex" xmlns:cx5="http://schemas.microsoft.com/office/drawing/2016/5/11/chartex" xmlns:cx6="http://schemas.microsoft.com/office/drawing/2016/5/12/chartex" xmlns:cx7="http://schemas.microsoft.com/office/drawing/2016/5/13/chartex" xmlns:cx8="http://schemas.microsoft.com/office/drawing/2016/5/14/chartex" xmlns:mc="http://schemas.openxmlformats.org/markup-compatibility/2006" xmlns:aink="http://schemas.microsoft.com/office/drawing/2016/ink" xmlns:am3d="http://schemas.microsoft.com/office/drawing/2017/model3d" xmlns:o="urn:schemas-microsoft-com:office:office" xmlns:oel="http://schemas.microsoft.com/office/2019/extlst" xmlns:r="http://schemas.openxmlformats.org/officeDocument/2006/relationships" xmlns:m="http://schemas.openxmlformats.org/officeDocument/2006/math" xmlns:v="urn:schemas-microsoft-com:vml" xmlns:wp14="http://schemas.microsoft.com/office/word/2010/wordprocessingDrawing" xmlns:wp="http://schemas.openxmlformats.org/drawingml/2006/wordprocessingDrawing" xmlns:w10="urn:schemas-microsoft-com:office:word" xmlns:w="http://schemas.openxmlformats.org/wordprocessingml/2006/main" xmlns:w14="http://schemas.microsoft.com/office/word/2010/wordml" xmlns:w15="http://schemas.microsoft.com/office/word/2012/wordml" xmlns:w16cex="http://schemas.microsoft.com/office/word/2018/wordml/cex" xmlns:w16cid="http://schemas.microsoft.com/office/word/2016/wordml/cid" xmlns:w16="http://schemas.microsoft.com/office/word/2018/wordml" xmlns:w16sdtdh="http://schemas.microsoft.com/office/word/2020/wordml/sdtdatahash" xmlns:w16se="http://schemas.microsoft.com/office/word/2015/wordml/symex" xmlns:wpg="http://schemas.microsoft.com/office/word/2010/wordprocessingGroup" xmlns:wpi="http://schemas.microsoft.com/office/word/2010/wordprocessingInk" xmlns:wne="http://schemas.microsoft.com/office/word/2006/wordml" xmlns:wps="http://schemas.microsoft.com/office/word/2010/wordprocessingShape" mc:Ignorable="w14 w15 w16se w16cid w16 w16cex w16sdtdh wp14">
   <w:endnote w:type="separator" w:id="-1">
     <w:p>
       <w:pPr>
@@ -116,7 +122,7 @@
 </file>
 
 <file path=word/footnotes.xml><?xml version="1.0" encoding="utf-8"?>
-<w:footnotes xmlns:wpc="http://schemas.microsoft.com/office/word/2010/wordprocessingCanvas" xmlns:cx="http://schemas.microsoft.com/office/drawing/2014/chartex" xmlns:cx1="http://schemas.microsoft.com/office/drawing/2015/9/8/chartex" xmlns:cx2="http://schemas.microsoft.com/office/drawing/2015/10/21/chartex" xmlns:cx3="http://schemas.microsoft.com/office/drawing/2016/5/9/chartex" xmlns:cx4="http://schemas.microsoft.com/office/drawing/2016/5/10/chartex" xmlns:cx5="http://schemas.microsoft.com/office/drawing/2016/5/11/chartex" xmlns:cx6="http://schemas.microsoft.com/office/drawing/2016/5/12/chartex" xmlns:cx7="http://schemas.microsoft.com/office/drawing/2016/5/13/chartex" xmlns:cx8="http://schemas.microsoft.com/office/drawing/2016/5/14/chartex" xmlns:mc="http://schemas.openxmlformats.org/markup-compatibility/2006" xmlns:aink="http://schemas.microsoft.com/office/drawing/2016/ink" xmlns:am3d="http://schemas.microsoft.com/office/drawing/2017/model3d" xmlns:o="urn:schemas-microsoft-com:office:office" xmlns:oel="http://schemas.microsoft.com/office/2019/extlst" xmlns:r="http://schemas.openxmlformats.org/officeDocument/2006/relationships" xmlns:m="http://schemas.openxmlformats.org/officeDocument/2006/math" xmlns:v="urn:schemas-microsoft-com:vml" xmlns:wp14="http://schemas.microsoft.com/office/word/2010/wordprocessingDrawing" xmlns:wp="http://schemas.openxmlformats.org/drawingml/2006/wordprocessingDrawing" xmlns:w10="urn:schemas-microsoft-com:office:word" xmlns:w="http://schemas.openxmlformats.org/wordprocessingml/2006/main" xmlns:w14="http://schemas.microsoft.com/office/word/2010/wordml" xmlns:w15="http://schemas.microsoft.com/office/word/2012/wordml" xmlns:w16cex="http://schemas.microsoft.com/office/word/2018/wordml/cex" xmlns:w16cid="http://schemas.microsoft.com/office/word/2016/wordml/cid" xmlns:w16="http://schemas.microsoft.com/office/word/2018/wordml" xmlns:w16du="http://schemas.microsoft.com/office/word/2023/wordml/word16du" xmlns:w16sdtdh="http://schemas.microsoft.com/office/word/2020/wordml/sdtdatahash" xmlns:w16se="http://schemas.microsoft.com/office/word/2015/wordml/symex" xmlns:wpg="http://schemas.microsoft.com/office/word/2010/wordprocessingGroup" xmlns:wpi="http://schemas.microsoft.com/office/word/2010/wordprocessingInk" xmlns:wne="http://schemas.microsoft.com/office/word/2006/wordml" xmlns:wps="http://schemas.microsoft.com/office/word/2010/wordprocessingShape" mc:Ignorable="w14 w15 w16se w16cid w16 w16cex w16sdtdh w16du wp14">
+<w:footnotes xmlns:wpc="http://schemas.microsoft.com/office/word/2010/wordprocessingCanvas" xmlns:cx="http://schemas.microsoft.com/office/drawing/2014/chartex" xmlns:cx1="http://schemas.microsoft.com/office/drawing/2015/9/8/chartex" xmlns:cx2="http://schemas.microsoft.com/office/drawing/2015/10/21/chartex" xmlns:cx3="http://schemas.microsoft.com/office/drawing/2016/5/9/chartex" xmlns:cx4="http://schemas.microsoft.com/office/drawing/2016/5/10/chartex" xmlns:cx5="http://schemas.microsoft.com/office/drawing/2016/5/11/chartex" xmlns:cx6="http://schemas.microsoft.com/office/drawing/2016/5/12/chartex" xmlns:cx7="http://schemas.microsoft.com/office/drawing/2016/5/13/chartex" xmlns:cx8="http://schemas.microsoft.com/office/drawing/2016/5/14/chartex" xmlns:mc="http://schemas.openxmlformats.org/markup-compatibility/2006" xmlns:aink="http://schemas.microsoft.com/office/drawing/2016/ink" xmlns:am3d="http://schemas.microsoft.com/office/drawing/2017/model3d" xmlns:o="urn:schemas-microsoft-com:office:office" xmlns:oel="http://schemas.microsoft.com/office/2019/extlst" xmlns:r="http://schemas.openxmlformats.org/officeDocument/2006/relationships" xmlns:m="http://schemas.openxmlformats.org/officeDocument/2006/math" xmlns:v="urn:schemas-microsoft-com:vml" xmlns:wp14="http://schemas.microsoft.com/office/word/2010/wordprocessingDrawing" xmlns:wp="http://schemas.openxmlformats.org/drawingml/2006/wordprocessingDrawing" xmlns:w10="urn:schemas-microsoft-com:office:word" xmlns:w="http://schemas.openxmlformats.org/wordprocessingml/2006/main" xmlns:w14="http://schemas.microsoft.com/office/word/2010/wordml" xmlns:w15="http://schemas.microsoft.com/office/word/2012/wordml" xmlns:w16cex="http://schemas.microsoft.com/office/word/2018/wordml/cex" xmlns:w16cid="http://schemas.microsoft.com/office/word/2016/wordml/cid" xmlns:w16="http://schemas.microsoft.com/office/word/2018/wordml" xmlns:w16sdtdh="http://schemas.microsoft.com/office/word/2020/wordml/sdtdatahash" xmlns:w16se="http://schemas.microsoft.com/office/word/2015/wordml/symex" xmlns:wpg="http://schemas.microsoft.com/office/word/2010/wordprocessingGroup" xmlns:wpi="http://schemas.microsoft.com/office/word/2010/wordprocessingInk" xmlns:wne="http://schemas.microsoft.com/office/word/2006/wordml" xmlns:wps="http://schemas.microsoft.com/office/word/2010/wordprocessingShape" mc:Ignorable="w14 w15 w16se w16cid w16 w16cex w16sdtdh wp14">
   <w:footnote w:type="separator" w:id="-1">
     <w:p>
       <w:pPr>
@@ -141,7 +147,7 @@
 </file>
 
 <file path=word/styles.xml><?xml version="1.0" encoding="utf-8"?>
-<w:styles xmlns:mc="http://schemas.openxmlformats.org/markup-compatibility/2006" xmlns:r="http://schemas.openxmlformats.org/officeDocument/2006/relationships" xmlns:w="http://schemas.openxmlformats.org/wordprocessingml/2006/main" xmlns:w14="http://schemas.microsoft.com/office/word/2010/wordml" xmlns:w15="http://schemas.microsoft.com/office/word/2012/wordml" xmlns:w16cex="http://schemas.microsoft.com/office/word/2018/wordml/cex" xmlns:w16cid="http://schemas.microsoft.com/office/word/2016/wordml/cid" xmlns:w16="http://schemas.microsoft.com/office/word/2018/wordml" xmlns:w16du="http://schemas.microsoft.com/office/word/2023/wordml/word16du" xmlns:w16sdtdh="http://schemas.microsoft.com/office/word/2020/wordml/sdtdatahash" xmlns:w16se="http://schemas.microsoft.com/office/word/2015/wordml/symex" mc:Ignorable="w14 w15 w16se w16cid w16 w16cex w16sdtdh w16du">
+<w:styles xmlns:mc="http://schemas.openxmlformats.org/markup-compatibility/2006" xmlns:r="http://schemas.openxmlformats.org/officeDocument/2006/relationships" xmlns:w="http://schemas.openxmlformats.org/wordprocessingml/2006/main" xmlns:w14="http://schemas.microsoft.com/office/word/2010/wordml" xmlns:w15="http://schemas.microsoft.com/office/word/2012/wordml" xmlns:w16cex="http://schemas.microsoft.com/office/word/2018/wordml/cex" xmlns:w16cid="http://schemas.microsoft.com/office/word/2016/wordml/cid" xmlns:w16="http://schemas.microsoft.com/office/word/2018/wordml" xmlns:w16sdtdh="http://schemas.microsoft.com/office/word/2020/wordml/sdtdatahash" xmlns:w16se="http://schemas.microsoft.com/office/word/2015/wordml/symex" mc:Ignorable="w14 w15 w16se w16cid w16 w16cex w16sdtdh">
   <w:docDefaults>
     <w:rPrDefault>
       <w:rPr>
@@ -1405,14 +1411,14 @@
 
 <file path=word/webextensions/taskpanes.xml><?xml version="1.0" encoding="utf-8"?>
 <wetp:taskpanes xmlns:wetp="http://schemas.microsoft.com/office/webextensions/taskpanes/2010/11">
-  <wetp:taskpane dockstate="right" visibility="0" width="525" row="0">
+  <wetp:taskpane dockstate="right" visibility="0" width="350" row="0">
     <wetp:webextensionref xmlns:r="http://schemas.openxmlformats.org/officeDocument/2006/relationships" r:id="rId1"/>
   </wetp:taskpane>
 </wetp:taskpanes>
 </file>
 
 <file path=word/webextensions/webextension1.xml><?xml version="1.0" encoding="utf-8"?>
-<we:webextension xmlns:we="http://schemas.microsoft.com/office/webextensions/webextension/2010/11" id="{EAB5F2B1-2A5A-460F-BFC3-4A1A1F48CA5E}">
+<we:webextension xmlns:we="http://schemas.microsoft.com/office/webextensions/webextension/2010/11" id="{3351D496-6D1F-9A4A-9F27-19C1245B98C6}">
   <we:reference id="0115cf6a-3048-47ca-abd1-7248654a3b50" version="1.0.0.5" store="developer" storeType="Registry"/>
   <we:alternateReferences/>
   <we:properties>

</xml_diff>